<commit_message>
add Yamaguchi san and edit welcome email
</commit_message>
<xml_diff>
--- a/事務/メールテンプレート/Ask first payment in cash.docx
+++ b/事務/メールテンプレート/Ask first payment in cash.docx
@@ -5,27 +5,27 @@
     <w:p>
       <w:pPr>
         <w:rPr>
-          <w:rFonts w:ascii="Yu Gothic" w:eastAsia="Yu Gothic" w:hAnsi="Yu Gothic" w:cstheme="minorBidi"/>
-          <w:szCs w:val="21"/>
-        </w:rPr>
-      </w:pPr>
-      <w:r>
-        <w:rPr>
-          <w:rFonts w:ascii="Yu Gothic" w:eastAsia="Yu Gothic" w:hAnsi="Yu Gothic" w:cstheme="minorBidi"/>
+          <w:rFonts w:ascii="游ゴシック" w:eastAsia="游ゴシック" w:hAnsi="游ゴシック" w:cstheme="minorBidi"/>
+          <w:szCs w:val="21"/>
+        </w:rPr>
+      </w:pPr>
+      <w:r>
+        <w:rPr>
+          <w:rFonts w:ascii="游ゴシック" w:eastAsia="游ゴシック" w:hAnsi="游ゴシック" w:cstheme="minorBidi"/>
           <w:szCs w:val="21"/>
         </w:rPr>
         <w:t>TITLE</w:t>
       </w:r>
       <w:r>
         <w:rPr>
-          <w:rFonts w:ascii="Yu Gothic" w:eastAsia="Yu Gothic" w:hAnsi="Yu Gothic" w:cstheme="minorBidi"/>
+          <w:rFonts w:ascii="游ゴシック" w:eastAsia="游ゴシック" w:hAnsi="游ゴシック" w:cstheme="minorBidi"/>
           <w:szCs w:val="21"/>
         </w:rPr>
         <w:br/>
       </w:r>
       <w:r>
         <w:rPr>
-          <w:rFonts w:ascii="Yu Gothic" w:eastAsia="Yu Gothic" w:hAnsi="Yu Gothic" w:cstheme="minorBidi" w:hint="eastAsia"/>
+          <w:rFonts w:ascii="游ゴシック" w:eastAsia="游ゴシック" w:hAnsi="游ゴシック" w:cstheme="minorBidi" w:hint="eastAsia"/>
           <w:szCs w:val="21"/>
         </w:rPr>
         <w:t>Bee Schoolへようこそ</w:t>
@@ -34,42 +34,42 @@
     <w:p>
       <w:pPr>
         <w:rPr>
-          <w:rFonts w:ascii="Yu Gothic" w:eastAsia="Yu Gothic" w:hAnsi="Yu Gothic" w:cstheme="minorBidi"/>
-          <w:szCs w:val="21"/>
-        </w:rPr>
-      </w:pPr>
+          <w:rFonts w:ascii="游ゴシック" w:eastAsia="游ゴシック" w:hAnsi="游ゴシック" w:cstheme="minorBidi"/>
+          <w:szCs w:val="21"/>
+        </w:rPr>
+      </w:pPr>
+      <w:bookmarkStart w:id="0" w:name="_Hlk209112086"/>
     </w:p>
     <w:p>
       <w:pPr>
         <w:rPr>
-          <w:rFonts w:ascii="Yu Gothic" w:eastAsia="Yu Gothic" w:hAnsi="Yu Gothic" w:cstheme="minorBidi"/>
-        </w:rPr>
-      </w:pPr>
-      <w:bookmarkStart w:id="0" w:name="_Hlk209112086"/>
-      <w:r>
-        <w:rPr>
-          <w:rFonts w:ascii="Yu Gothic" w:eastAsia="Yu Gothic" w:hAnsi="Yu Gothic" w:cstheme="minorBidi"/>
+          <w:rFonts w:ascii="游ゴシック" w:eastAsia="游ゴシック" w:hAnsi="游ゴシック" w:cstheme="minorBidi"/>
+        </w:rPr>
+      </w:pPr>
+      <w:r>
+        <w:rPr>
+          <w:rFonts w:ascii="游ゴシック" w:eastAsia="游ゴシック" w:hAnsi="游ゴシック" w:cstheme="minorBidi"/>
           <w:szCs w:val="21"/>
         </w:rPr>
         <w:t>XX</w:t>
       </w:r>
       <w:r>
         <w:rPr>
-          <w:rFonts w:ascii="Yu Gothic" w:eastAsia="Yu Gothic" w:hAnsi="Yu Gothic" w:cstheme="minorBidi" w:hint="eastAsia"/>
+          <w:rFonts w:ascii="游ゴシック" w:eastAsia="游ゴシック" w:hAnsi="游ゴシック" w:cstheme="minorBidi" w:hint="eastAsia"/>
           <w:szCs w:val="21"/>
         </w:rPr>
         <w:t>様</w:t>
       </w:r>
       <w:r>
         <w:rPr>
-          <w:rFonts w:ascii="Yu Gothic" w:eastAsia="Yu Gothic" w:hAnsi="Yu Gothic" w:cstheme="minorBidi"/>
+          <w:rFonts w:ascii="游ゴシック" w:eastAsia="游ゴシック" w:hAnsi="游ゴシック" w:cstheme="minorBidi"/>
           <w:szCs w:val="21"/>
         </w:rPr>
         <w:t>, XX</w:t>
       </w:r>
       <w:r>
         <w:rPr>
-          <w:rFonts w:ascii="Yu Gothic" w:eastAsia="Yu Gothic" w:hAnsi="Yu Gothic" w:cstheme="minorBidi" w:hint="eastAsia"/>
+          <w:rFonts w:ascii="游ゴシック" w:eastAsia="游ゴシック" w:hAnsi="游ゴシック" w:cstheme="minorBidi" w:hint="eastAsia"/>
           <w:szCs w:val="21"/>
         </w:rPr>
         <w:t>様</w:t>
@@ -77,7 +77,7 @@
       <w:bookmarkEnd w:id="0"/>
       <w:r>
         <w:rPr>
-          <w:rFonts w:ascii="Yu Gothic" w:eastAsia="Yu Gothic" w:hAnsi="Yu Gothic" w:cstheme="minorBidi"/>
+          <w:rFonts w:ascii="游ゴシック" w:eastAsia="游ゴシック" w:hAnsi="游ゴシック" w:cstheme="minorBidi"/>
           <w:szCs w:val="21"/>
         </w:rPr>
         <w:br/>
@@ -85,234 +85,67 @@
       </w:r>
       <w:r>
         <w:rPr>
-          <w:rFonts w:ascii="Yu Gothic" w:eastAsia="Yu Gothic" w:hAnsi="Yu Gothic" w:cstheme="minorBidi" w:hint="eastAsia"/>
+          <w:rFonts w:ascii="游ゴシック" w:eastAsia="游ゴシック" w:hAnsi="游ゴシック" w:cstheme="minorBidi" w:hint="eastAsia"/>
           <w:szCs w:val="21"/>
         </w:rPr>
         <w:t xml:space="preserve">です。 </w:t>
       </w:r>
       <w:r>
         <w:rPr>
-          <w:rFonts w:ascii="Yu Gothic" w:eastAsia="Yu Gothic" w:hAnsi="Yu Gothic" w:cstheme="minorBidi"/>
+          <w:rFonts w:ascii="游ゴシック" w:eastAsia="游ゴシック" w:hAnsi="游ゴシック" w:cstheme="minorBidi"/>
           <w:szCs w:val="21"/>
         </w:rPr>
         <w:br/>
       </w:r>
       <w:r>
         <w:rPr>
-          <w:rFonts w:ascii="Yu Gothic" w:eastAsia="Yu Gothic" w:hAnsi="Yu Gothic" w:cstheme="minorBidi" w:hint="eastAsia"/>
+          <w:rFonts w:ascii="游ゴシック" w:eastAsia="游ゴシック" w:hAnsi="游ゴシック" w:cstheme="minorBidi" w:hint="eastAsia"/>
           <w:szCs w:val="21"/>
         </w:rPr>
         <w:t xml:space="preserve">ご入会ありがとうございます！ </w:t>
       </w:r>
       <w:r>
         <w:rPr>
-          <w:rFonts w:ascii="Yu Gothic" w:eastAsia="Yu Gothic" w:hAnsi="Yu Gothic" w:cstheme="minorBidi"/>
+          <w:rFonts w:ascii="游ゴシック" w:eastAsia="游ゴシック" w:hAnsi="游ゴシック" w:cstheme="minorBidi"/>
           <w:szCs w:val="21"/>
         </w:rPr>
         <w:br/>
       </w:r>
       <w:r>
         <w:rPr>
-          <w:rFonts w:ascii="Yu Gothic" w:eastAsia="Yu Gothic" w:hAnsi="Yu Gothic" w:cstheme="minorBidi"/>
+          <w:rFonts w:ascii="游ゴシック" w:eastAsia="游ゴシック" w:hAnsi="游ゴシック" w:cstheme="minorBidi"/>
           <w:szCs w:val="21"/>
         </w:rPr>
         <w:br/>
       </w:r>
       <w:r>
         <w:rPr>
-          <w:rFonts w:ascii="Yu Gothic" w:eastAsia="Yu Gothic" w:hAnsi="Yu Gothic" w:cstheme="minorBidi" w:hint="eastAsia"/>
-          <w:szCs w:val="21"/>
-        </w:rPr>
-        <w:t xml:space="preserve">銀行引き落とし手続き開始前に、入会金と月謝を現金でお支払いいただきますようお願いいたします。 </w:t>
-      </w:r>
-      <w:r>
-        <w:rPr>
-          <w:rFonts w:ascii="Yu Gothic" w:eastAsia="Yu Gothic" w:hAnsi="Yu Gothic" w:cstheme="minorBidi"/>
-          <w:szCs w:val="21"/>
-        </w:rPr>
-        <w:t>11</w:t>
-      </w:r>
-      <w:r>
-        <w:rPr>
-          <w:rFonts w:ascii="Yu Gothic" w:eastAsia="Yu Gothic" w:hAnsi="Yu Gothic" w:cstheme="minorBidi" w:hint="eastAsia"/>
-          <w:szCs w:val="21"/>
-        </w:rPr>
-        <w:t>月目以降は銀行口座からの引き落としとなりますので、次回レッスンの申込書をお渡しいたします。</w:t>
-      </w:r>
-      <w:r>
-        <w:rPr>
-          <w:rFonts w:ascii="Yu Gothic" w:eastAsia="Yu Gothic" w:hAnsi="Yu Gothic" w:cstheme="minorBidi"/>
-          <w:szCs w:val="21"/>
+          <w:rFonts w:ascii="游ゴシック" w:eastAsia="游ゴシック" w:hAnsi="游ゴシック" w:cstheme="minorBidi"/>
+        </w:rPr>
+        <w:t>この度は、数あるスクールの中からBee Schoolをお選びいただきましたこと、心より光栄に存じます。</w:t>
+      </w:r>
+      <w:r>
+        <w:rPr>
+          <w:rFonts w:ascii="游ゴシック" w:eastAsia="游ゴシック" w:hAnsi="游ゴシック" w:cstheme="minorBidi"/>
         </w:rPr>
         <w:br/>
       </w:r>
       <w:r>
         <w:rPr>
-          <w:rFonts w:ascii="Yu Gothic" w:eastAsia="Yu Gothic" w:hAnsi="Yu Gothic" w:cstheme="minorBidi" w:hint="eastAsia"/>
-          <w:szCs w:val="21"/>
-        </w:rPr>
-        <w:t>お支払いいただく合計金額は</w:t>
-      </w:r>
-      <w:r>
-        <w:rPr>
-          <w:rFonts w:ascii="Yu Gothic" w:eastAsia="Yu Gothic" w:hAnsi="Yu Gothic" w:cstheme="minorBidi" w:hint="eastAsia"/>
-          <w:szCs w:val="21"/>
-        </w:rPr>
-        <w:t>2</w:t>
-      </w:r>
-      <w:r>
-        <w:rPr>
-          <w:rFonts w:ascii="Yu Gothic" w:eastAsia="Yu Gothic" w:hAnsi="Yu Gothic" w:cstheme="minorBidi"/>
-          <w:szCs w:val="21"/>
-        </w:rPr>
-        <w:t>7</w:t>
-      </w:r>
-      <w:r>
-        <w:rPr>
-          <w:rFonts w:ascii="Yu Gothic" w:eastAsia="Yu Gothic" w:hAnsi="Yu Gothic" w:cstheme="minorBidi" w:hint="eastAsia"/>
-          <w:szCs w:val="21"/>
-        </w:rPr>
-        <w:t>,</w:t>
-      </w:r>
-      <w:r>
-        <w:rPr>
-          <w:rFonts w:ascii="Yu Gothic" w:eastAsia="Yu Gothic" w:hAnsi="Yu Gothic" w:cstheme="minorBidi"/>
-          <w:szCs w:val="21"/>
-        </w:rPr>
-        <w:t>4</w:t>
-      </w:r>
-      <w:r>
-        <w:rPr>
-          <w:rFonts w:ascii="Yu Gothic" w:eastAsia="Yu Gothic" w:hAnsi="Yu Gothic" w:cstheme="minorBidi"/>
-          <w:szCs w:val="21"/>
-        </w:rPr>
-        <w:t>8</w:t>
-      </w:r>
-      <w:r>
-        <w:rPr>
-          <w:rFonts w:ascii="Yu Gothic" w:eastAsia="Yu Gothic" w:hAnsi="Yu Gothic" w:cstheme="minorBidi" w:hint="eastAsia"/>
-          <w:szCs w:val="21"/>
-        </w:rPr>
-        <w:t>0円（</w:t>
-      </w:r>
-      <w:r>
-        <w:rPr>
-          <w:rFonts w:ascii="Yu Gothic" w:eastAsia="Yu Gothic" w:hAnsi="Yu Gothic" w:cstheme="minorBidi" w:hint="eastAsia"/>
-          <w:szCs w:val="21"/>
-        </w:rPr>
-        <w:t>XX</w:t>
-      </w:r>
-      <w:r>
-        <w:rPr>
-          <w:rFonts w:ascii="Yu Gothic" w:eastAsia="Yu Gothic" w:hAnsi="Yu Gothic" w:cstheme="minorBidi" w:hint="eastAsia"/>
-          <w:szCs w:val="21"/>
-        </w:rPr>
-        <w:t>月</w:t>
-      </w:r>
-      <w:r>
-        <w:rPr>
-          <w:rFonts w:ascii="Yu Gothic" w:eastAsia="Yu Gothic" w:hAnsi="Yu Gothic" w:cstheme="minorBidi" w:hint="eastAsia"/>
-          <w:szCs w:val="21"/>
-        </w:rPr>
-        <w:t>分</w:t>
-      </w:r>
-      <w:r>
-        <w:rPr>
-          <w:rFonts w:ascii="Yu Gothic" w:eastAsia="Yu Gothic" w:hAnsi="Yu Gothic" w:cstheme="minorBidi" w:hint="eastAsia"/>
-          <w:szCs w:val="21"/>
-        </w:rPr>
-        <w:t>月謝</w:t>
-      </w:r>
-      <w:r>
-        <w:rPr>
-          <w:rFonts w:ascii="Yu Gothic" w:eastAsia="Yu Gothic" w:hAnsi="Yu Gothic" w:cstheme="minorBidi"/>
-          <w:szCs w:val="21"/>
-        </w:rPr>
-        <w:t>7</w:t>
-      </w:r>
-      <w:r>
-        <w:rPr>
-          <w:rFonts w:ascii="Yu Gothic" w:eastAsia="Yu Gothic" w:hAnsi="Yu Gothic" w:cstheme="minorBidi" w:hint="eastAsia"/>
-          <w:szCs w:val="21"/>
-        </w:rPr>
-        <w:t>,</w:t>
-      </w:r>
-      <w:r>
-        <w:rPr>
-          <w:rFonts w:ascii="Yu Gothic" w:eastAsia="Yu Gothic" w:hAnsi="Yu Gothic" w:cstheme="minorBidi"/>
-          <w:szCs w:val="21"/>
-        </w:rPr>
-        <w:t>0</w:t>
-      </w:r>
-      <w:r>
-        <w:rPr>
-          <w:rFonts w:ascii="Yu Gothic" w:eastAsia="Yu Gothic" w:hAnsi="Yu Gothic" w:cstheme="minorBidi" w:hint="eastAsia"/>
-          <w:szCs w:val="21"/>
-        </w:rPr>
-        <w:t>00円-入会金16,</w:t>
-      </w:r>
-      <w:r>
-        <w:rPr>
-          <w:rFonts w:ascii="Yu Gothic" w:eastAsia="Yu Gothic" w:hAnsi="Yu Gothic" w:cstheme="minorBidi"/>
-          <w:szCs w:val="21"/>
-        </w:rPr>
-        <w:t>980</w:t>
-      </w:r>
-      <w:r>
-        <w:rPr>
-          <w:rFonts w:ascii="Yu Gothic" w:eastAsia="Yu Gothic" w:hAnsi="Yu Gothic" w:cstheme="minorBidi" w:hint="eastAsia"/>
-          <w:szCs w:val="21"/>
-        </w:rPr>
-        <w:t xml:space="preserve">円-諸経費3,500円）です。 その後はご指定の銀行口座から月謝が引き落とされます。 </w:t>
-      </w:r>
-      <w:r>
-        <w:rPr>
-          <w:rFonts w:ascii="Yu Gothic" w:eastAsia="Yu Gothic" w:hAnsi="Yu Gothic" w:cstheme="minorBidi"/>
-          <w:szCs w:val="21"/>
-        </w:rPr>
-        <w:br/>
-      </w:r>
-      <w:r>
-        <w:rPr>
-          <w:rFonts w:ascii="Yu Gothic" w:eastAsia="Yu Gothic" w:hAnsi="Yu Gothic" w:cstheme="minorHAnsi" w:hint="eastAsia"/>
-        </w:rPr>
-        <w:t>ご迷惑をおかけして申し訳ございませんが、ご理解いただけますようお願いいたします。</w:t>
-      </w:r>
-      <w:r>
-        <w:rPr>
-          <w:rFonts w:ascii="Yu Gothic" w:eastAsia="Yu Gothic" w:hAnsi="Yu Gothic" w:cstheme="minorHAnsi"/>
-        </w:rPr>
-        <w:br/>
-      </w:r>
-      <w:r>
-        <w:rPr>
-          <w:rFonts w:ascii="Yu Gothic" w:eastAsia="Yu Gothic" w:hAnsi="Yu Gothic" w:cstheme="minorHAnsi"/>
-        </w:rPr>
-        <w:br/>
-      </w:r>
-      <w:r>
-        <w:rPr>
-          <w:rFonts w:ascii="Yu Gothic" w:eastAsia="Yu Gothic" w:hAnsi="Yu Gothic" w:cstheme="minorBidi"/>
-        </w:rPr>
-        <w:t>また、この度数あるスクールの中からBee Schoolをお選びいただきましたこと、心より光栄に存じます。</w:t>
-      </w:r>
-      <w:r>
-        <w:rPr>
-          <w:rFonts w:ascii="Yu Gothic" w:eastAsia="Yu Gothic" w:hAnsi="Yu Gothic" w:cstheme="minorBidi"/>
-        </w:rPr>
-        <w:br/>
-        <w:t>お子様の教育は私たちにとって最優先事項であり、常に最高品質のレッスンを提供することをお約束いたします。</w:t>
+          <w:rFonts w:ascii="游ゴシック" w:eastAsia="游ゴシック" w:hAnsi="游ゴシック" w:cstheme="minorBidi"/>
+        </w:rPr>
+        <w:t>楽しく、着実に英語力を伸ばしていただけるよう、一人ひとりの目標やニーズに合わせたレッスンを提供してまいります。</w:t>
       </w:r>
     </w:p>
     <w:p>
       <w:pPr>
         <w:rPr>
-          <w:rFonts w:ascii="Yu Gothic" w:eastAsia="Yu Gothic" w:hAnsi="Yu Gothic" w:cstheme="minorBidi"/>
-        </w:rPr>
-      </w:pPr>
-      <w:r>
-        <w:rPr>
-          <w:rFonts w:ascii="Yu Gothic" w:eastAsia="Yu Gothic" w:hAnsi="Yu Gothic" w:cstheme="minorBidi"/>
+          <w:rFonts w:ascii="游ゴシック" w:eastAsia="游ゴシック" w:hAnsi="游ゴシック" w:cstheme="minorBidi"/>
+        </w:rPr>
+      </w:pPr>
+      <w:r>
+        <w:rPr>
+          <w:rFonts w:ascii="游ゴシック" w:eastAsia="游ゴシック" w:hAnsi="游ゴシック" w:cstheme="minorBidi"/>
         </w:rPr>
         <w:t>Bee Schoolでは以下のような多彩な学習支援をご利用いただけます：</w:t>
       </w:r>
@@ -324,38 +157,26 @@
           <w:numId w:val="1"/>
         </w:numPr>
         <w:rPr>
-          <w:rFonts w:ascii="Yu Gothic" w:eastAsia="Yu Gothic" w:hAnsi="Yu Gothic" w:cstheme="minorBidi"/>
-        </w:rPr>
-      </w:pPr>
-      <w:r>
-        <w:rPr>
-          <w:rFonts w:ascii="Yu Gothic" w:eastAsia="Yu Gothic" w:hAnsi="Yu Gothic" w:cstheme="minorBidi"/>
-        </w:rPr>
-        <w:t>AI</w:t>
-      </w:r>
-      <w:r>
-        <w:rPr>
-          <w:rFonts w:ascii="Yu Gothic" w:eastAsia="Yu Gothic" w:hAnsi="Yu Gothic" w:cstheme="minorBidi" w:hint="eastAsia"/>
-        </w:rPr>
-        <w:t>やアップ</w:t>
-      </w:r>
-      <w:r>
-        <w:rPr>
-          <w:rFonts w:ascii="Yu Gothic" w:eastAsia="Yu Gothic" w:hAnsi="Yu Gothic" w:cstheme="minorBidi"/>
-        </w:rPr>
-        <w:t>を活用した学習サポート</w:t>
-      </w:r>
-      <w:r>
-        <w:rPr>
-          <w:rFonts w:ascii="Yu Gothic" w:eastAsia="Yu Gothic" w:hAnsi="Yu Gothic" w:cstheme="minorBidi"/>
+          <w:rFonts w:ascii="游ゴシック" w:eastAsia="游ゴシック" w:hAnsi="游ゴシック" w:cstheme="minorBidi"/>
+        </w:rPr>
+      </w:pPr>
+      <w:r>
+        <w:rPr>
+          <w:rFonts w:ascii="游ゴシック" w:eastAsia="游ゴシック" w:hAnsi="游ゴシック" w:cstheme="minorBidi"/>
+        </w:rPr>
+        <w:t>AI・学習アプリを活用した学習サポート</w:t>
+      </w:r>
+      <w:r>
+        <w:rPr>
+          <w:rFonts w:ascii="游ゴシック" w:eastAsia="游ゴシック" w:hAnsi="游ゴシック" w:cstheme="minorBidi"/>
         </w:rPr>
         <w:t xml:space="preserve"> </w:t>
       </w:r>
       <w:hyperlink r:id="rId5" w:history="1">
         <w:r>
           <w:rPr>
-            <w:rStyle w:val="Hyperlink"/>
-            <w:rFonts w:ascii="Yu Gothic" w:eastAsia="Yu Gothic" w:hAnsi="Yu Gothic" w:cstheme="minorBidi" w:hint="eastAsia"/>
+            <w:rStyle w:val="a5"/>
+            <w:rFonts w:ascii="游ゴシック" w:eastAsia="游ゴシック" w:hAnsi="游ゴシック" w:cstheme="minorBidi" w:hint="eastAsia"/>
           </w:rPr>
           <w:t>今すぐサイトへアクセス</w:t>
         </w:r>
@@ -368,26 +189,26 @@
           <w:numId w:val="1"/>
         </w:numPr>
         <w:rPr>
-          <w:rFonts w:ascii="Yu Gothic" w:eastAsia="Yu Gothic" w:hAnsi="Yu Gothic" w:cstheme="minorBidi"/>
-        </w:rPr>
-      </w:pPr>
-      <w:r>
-        <w:rPr>
-          <w:rFonts w:ascii="Yu Gothic" w:eastAsia="Yu Gothic" w:hAnsi="Yu Gothic" w:cstheme="minorBidi"/>
+          <w:rFonts w:ascii="游ゴシック" w:eastAsia="游ゴシック" w:hAnsi="游ゴシック" w:cstheme="minorBidi"/>
+        </w:rPr>
+      </w:pPr>
+      <w:r>
+        <w:rPr>
+          <w:rFonts w:ascii="游ゴシック" w:eastAsia="游ゴシック" w:hAnsi="游ゴシック" w:cstheme="minorBidi"/>
         </w:rPr>
         <w:t>英検対策専用サイトの利用</w:t>
       </w:r>
       <w:r>
         <w:rPr>
-          <w:rFonts w:ascii="Yu Gothic" w:eastAsia="Yu Gothic" w:hAnsi="Yu Gothic" w:cstheme="minorBidi"/>
+          <w:rFonts w:ascii="游ゴシック" w:eastAsia="游ゴシック" w:hAnsi="游ゴシック" w:cstheme="minorBidi"/>
         </w:rPr>
         <w:t xml:space="preserve"> </w:t>
       </w:r>
       <w:hyperlink r:id="rId6" w:history="1">
         <w:r>
           <w:rPr>
-            <w:rStyle w:val="Hyperlink"/>
-            <w:rFonts w:ascii="Yu Gothic" w:eastAsia="Yu Gothic" w:hAnsi="Yu Gothic" w:cstheme="minorBidi" w:hint="eastAsia"/>
+            <w:rStyle w:val="a5"/>
+            <w:rFonts w:ascii="游ゴシック" w:eastAsia="游ゴシック" w:hAnsi="游ゴシック" w:cstheme="minorBidi" w:hint="eastAsia"/>
           </w:rPr>
           <w:t>今すぐサイトへアクセス</w:t>
         </w:r>
@@ -400,112 +221,284 @@
           <w:numId w:val="1"/>
         </w:numPr>
         <w:rPr>
-          <w:rFonts w:ascii="Yu Gothic" w:eastAsia="Yu Gothic" w:hAnsi="Yu Gothic" w:cstheme="minorBidi"/>
-        </w:rPr>
-      </w:pPr>
-      <w:r>
-        <w:rPr>
-          <w:rFonts w:ascii="Yu Gothic" w:eastAsia="Yu Gothic" w:hAnsi="Yu Gothic" w:cstheme="minorBidi"/>
-        </w:rPr>
-        <w:t>ネイティブ講師・日本人講師の両方による指導</w:t>
+          <w:rFonts w:ascii="游ゴシック" w:eastAsia="游ゴシック" w:hAnsi="游ゴシック" w:cstheme="minorBidi"/>
+        </w:rPr>
+      </w:pPr>
+      <w:r>
+        <w:rPr>
+          <w:rFonts w:ascii="游ゴシック" w:eastAsia="游ゴシック" w:hAnsi="游ゴシック" w:cstheme="minorBidi"/>
+        </w:rPr>
+        <w:t>試験・面接対策</w:t>
       </w:r>
     </w:p>
     <w:p>
       <w:pPr>
-        <w:numPr>
-          <w:ilvl w:val="0"/>
-          <w:numId w:val="1"/>
-        </w:numPr>
-        <w:rPr>
-          <w:rFonts w:ascii="Yu Gothic" w:eastAsia="Yu Gothic" w:hAnsi="Yu Gothic" w:cstheme="minorBidi"/>
-        </w:rPr>
-      </w:pPr>
-      <w:r>
-        <w:rPr>
-          <w:rFonts w:ascii="Yu Gothic" w:eastAsia="Yu Gothic" w:hAnsi="Yu Gothic" w:cstheme="minorBidi"/>
-        </w:rPr>
-        <w:t>試験・面接対策</w:t>
+        <w:rPr>
+          <w:rFonts w:ascii="游ゴシック" w:eastAsia="游ゴシック" w:hAnsi="游ゴシック" w:cs="Times New Roman"/>
+        </w:rPr>
+      </w:pPr>
+      <w:r>
+        <w:rPr>
+          <w:rFonts w:ascii="游ゴシック" w:eastAsia="游ゴシック" w:hAnsi="游ゴシック" w:cstheme="minorBidi"/>
+        </w:rPr>
+        <w:t>Bee Schoolでは、テストや英検のための英語だけでなく、自信を持って英語でコミュニケーションできる力を育てることを大切にしています。</w:t>
+      </w:r>
+      <w:r>
+        <w:rPr>
+          <w:rFonts w:ascii="游ゴシック" w:eastAsia="游ゴシック" w:hAnsi="游ゴシック" w:cstheme="minorBidi"/>
+        </w:rPr>
+        <w:br/>
       </w:r>
     </w:p>
     <w:p>
       <w:pPr>
         <w:rPr>
-          <w:rFonts w:ascii="Yu Gothic" w:eastAsia="Yu Gothic" w:hAnsi="Yu Gothic" w:cstheme="minorBidi"/>
-        </w:rPr>
-      </w:pPr>
-      <w:r>
-        <w:rPr>
-          <w:rFonts w:ascii="Yu Gothic" w:eastAsia="Yu Gothic" w:hAnsi="Yu Gothic" w:cstheme="minorBidi"/>
-        </w:rPr>
-        <w:t>Beeを選ぶことは、単にテストの成績向上を保証するだけでなく、</w:t>
-      </w:r>
-      <w:r>
-        <w:rPr>
-          <w:rFonts w:ascii="Yu Gothic" w:eastAsia="Yu Gothic" w:hAnsi="Yu Gothic" w:cstheme="minorBidi"/>
+          <w:rFonts w:ascii="游ゴシック" w:eastAsia="游ゴシック" w:hAnsi="游ゴシック" w:cstheme="minorBidi" w:hint="eastAsia"/>
+        </w:rPr>
+      </w:pPr>
+      <w:r>
+        <w:rPr>
+          <w:rFonts w:ascii="游ゴシック" w:eastAsia="游ゴシック" w:hAnsi="游ゴシック" w:cstheme="minorBidi" w:hint="eastAsia"/>
+          <w:szCs w:val="21"/>
+        </w:rPr>
+        <w:lastRenderedPageBreak/>
+        <w:t xml:space="preserve">銀行引き落とし手続き開始前に、入会金と月謝を現金でお支払いいただきますようお願いいたします。 </w:t>
+      </w:r>
+      <w:r>
+        <w:rPr>
+          <w:rFonts w:ascii="游ゴシック" w:eastAsia="游ゴシック" w:hAnsi="游ゴシック" w:cstheme="minorBidi"/>
+          <w:szCs w:val="21"/>
+        </w:rPr>
+        <w:t>翌月以降は、ご指定の銀行口座からの引き落としとなります。</w:t>
+      </w:r>
+      <w:r>
+        <w:rPr>
+          <w:rFonts w:ascii="游ゴシック" w:eastAsia="游ゴシック" w:hAnsi="游ゴシック" w:cstheme="minorBidi"/>
+          <w:szCs w:val="21"/>
         </w:rPr>
         <w:br/>
       </w:r>
       <w:r>
         <w:rPr>
-          <w:rFonts w:ascii="Yu Gothic" w:eastAsia="Yu Gothic" w:hAnsi="Yu Gothic" w:cstheme="minorBidi"/>
-          <w:b/>
-          <w:bCs/>
-        </w:rPr>
-        <w:t>英語を自信を持って話せるようになること、そして未来の新たな可能性を切り開く第一歩</w:t>
-      </w:r>
-      <w:r>
-        <w:rPr>
-          <w:rFonts w:ascii="Yu Gothic" w:eastAsia="Yu Gothic" w:hAnsi="Yu Gothic" w:cstheme="minorBidi"/>
-        </w:rPr>
-        <w:t>です。</w:t>
+          <w:rFonts w:ascii="游ゴシック" w:eastAsia="游ゴシック" w:hAnsi="游ゴシック" w:cstheme="minorBidi" w:hint="eastAsia"/>
+          <w:szCs w:val="21"/>
+        </w:rPr>
+        <w:t>お支払いいただく合計金額は</w:t>
+      </w:r>
+      <w:r>
+        <w:rPr>
+          <w:rFonts w:ascii="游ゴシック" w:eastAsia="游ゴシック" w:hAnsi="游ゴシック" w:cstheme="minorBidi" w:hint="eastAsia"/>
+          <w:szCs w:val="21"/>
+        </w:rPr>
+        <w:t>49</w:t>
+      </w:r>
+      <w:r>
+        <w:rPr>
+          <w:rFonts w:ascii="游ゴシック" w:eastAsia="游ゴシック" w:hAnsi="游ゴシック" w:cstheme="minorBidi" w:hint="eastAsia"/>
+          <w:szCs w:val="21"/>
+        </w:rPr>
+        <w:t>,</w:t>
+      </w:r>
+      <w:r>
+        <w:rPr>
+          <w:rFonts w:ascii="游ゴシック" w:eastAsia="游ゴシック" w:hAnsi="游ゴシック" w:cstheme="minorBidi" w:hint="eastAsia"/>
+          <w:szCs w:val="21"/>
+        </w:rPr>
+        <w:t>9</w:t>
+      </w:r>
+      <w:r>
+        <w:rPr>
+          <w:rFonts w:ascii="游ゴシック" w:eastAsia="游ゴシック" w:hAnsi="游ゴシック" w:cstheme="minorBidi"/>
+          <w:szCs w:val="21"/>
+        </w:rPr>
+        <w:t>8</w:t>
+      </w:r>
+      <w:r>
+        <w:rPr>
+          <w:rFonts w:ascii="游ゴシック" w:eastAsia="游ゴシック" w:hAnsi="游ゴシック" w:cstheme="minorBidi" w:hint="eastAsia"/>
+          <w:szCs w:val="21"/>
+        </w:rPr>
+        <w:t>0円（</w:t>
+      </w:r>
+      <w:r>
+        <w:rPr>
+          <w:rFonts w:ascii="游ゴシック" w:eastAsia="游ゴシック" w:hAnsi="游ゴシック" w:cstheme="minorBidi" w:hint="eastAsia"/>
+          <w:szCs w:val="21"/>
+        </w:rPr>
+        <w:t>XX</w:t>
+      </w:r>
+      <w:r>
+        <w:rPr>
+          <w:rFonts w:ascii="游ゴシック" w:eastAsia="游ゴシック" w:hAnsi="游ゴシック" w:cstheme="minorBidi" w:hint="eastAsia"/>
+          <w:szCs w:val="21"/>
+        </w:rPr>
+        <w:t>月</w:t>
+      </w:r>
+      <w:r>
+        <w:rPr>
+          <w:rFonts w:ascii="游ゴシック" w:eastAsia="游ゴシック" w:hAnsi="游ゴシック" w:cstheme="minorBidi" w:hint="eastAsia"/>
+          <w:szCs w:val="21"/>
+        </w:rPr>
+        <w:t>分</w:t>
+      </w:r>
+      <w:r>
+        <w:rPr>
+          <w:rFonts w:ascii="游ゴシック" w:eastAsia="游ゴシック" w:hAnsi="游ゴシック" w:cstheme="minorBidi" w:hint="eastAsia"/>
+          <w:szCs w:val="21"/>
+        </w:rPr>
+        <w:t>月謝</w:t>
+      </w:r>
+      <w:r>
+        <w:rPr>
+          <w:rFonts w:ascii="游ゴシック" w:eastAsia="游ゴシック" w:hAnsi="游ゴシック" w:cstheme="minorBidi"/>
+          <w:szCs w:val="21"/>
+        </w:rPr>
+        <w:t>7</w:t>
+      </w:r>
+      <w:r>
+        <w:rPr>
+          <w:rFonts w:ascii="游ゴシック" w:eastAsia="游ゴシック" w:hAnsi="游ゴシック" w:cstheme="minorBidi" w:hint="eastAsia"/>
+          <w:szCs w:val="21"/>
+        </w:rPr>
+        <w:t>,</w:t>
+      </w:r>
+      <w:r>
+        <w:rPr>
+          <w:rFonts w:ascii="游ゴシック" w:eastAsia="游ゴシック" w:hAnsi="游ゴシック" w:cstheme="minorBidi"/>
+          <w:szCs w:val="21"/>
+        </w:rPr>
+        <w:t>0</w:t>
+      </w:r>
+      <w:r>
+        <w:rPr>
+          <w:rFonts w:ascii="游ゴシック" w:eastAsia="游ゴシック" w:hAnsi="游ゴシック" w:cstheme="minorBidi" w:hint="eastAsia"/>
+          <w:szCs w:val="21"/>
+        </w:rPr>
+        <w:t>00円</w:t>
+      </w:r>
+      <w:r>
+        <w:rPr>
+          <w:rFonts w:ascii="游ゴシック" w:eastAsia="游ゴシック" w:hAnsi="游ゴシック" w:cstheme="minorBidi" w:hint="eastAsia"/>
+          <w:szCs w:val="21"/>
+        </w:rPr>
+        <w:t>＋</w:t>
+      </w:r>
+      <w:r>
+        <w:rPr>
+          <w:rFonts w:ascii="游ゴシック" w:eastAsia="游ゴシック" w:hAnsi="游ゴシック" w:cstheme="minorBidi" w:hint="eastAsia"/>
+          <w:szCs w:val="21"/>
+        </w:rPr>
+        <w:t>入会金16,</w:t>
+      </w:r>
+      <w:r>
+        <w:rPr>
+          <w:rFonts w:ascii="游ゴシック" w:eastAsia="游ゴシック" w:hAnsi="游ゴシック" w:cstheme="minorBidi"/>
+          <w:szCs w:val="21"/>
+        </w:rPr>
+        <w:t>980</w:t>
+      </w:r>
+      <w:r>
+        <w:rPr>
+          <w:rFonts w:ascii="游ゴシック" w:eastAsia="游ゴシック" w:hAnsi="游ゴシック" w:cstheme="minorBidi" w:hint="eastAsia"/>
+          <w:szCs w:val="21"/>
+        </w:rPr>
+        <w:t>円</w:t>
+      </w:r>
+      <w:r>
+        <w:rPr>
+          <w:rFonts w:ascii="游ゴシック" w:eastAsia="游ゴシック" w:hAnsi="游ゴシック" w:cstheme="minorBidi" w:hint="eastAsia"/>
+          <w:szCs w:val="21"/>
+        </w:rPr>
+        <w:t>＋</w:t>
+      </w:r>
+      <w:r>
+        <w:rPr>
+          <w:rFonts w:ascii="游ゴシック" w:eastAsia="游ゴシック" w:hAnsi="游ゴシック" w:cstheme="minorBidi" w:hint="eastAsia"/>
+          <w:szCs w:val="21"/>
+        </w:rPr>
+        <w:t>諸経費3,500円</w:t>
+      </w:r>
+      <w:r>
+        <w:rPr>
+          <w:rFonts w:ascii="游ゴシック" w:eastAsia="游ゴシック" w:hAnsi="游ゴシック" w:cstheme="minorBidi"/>
+          <w:szCs w:val="21"/>
+        </w:rPr>
+        <w:t>＋保証金20,000円）です。</w:t>
+      </w:r>
+      <w:r>
+        <w:rPr>
+          <w:rFonts w:ascii="游ゴシック" w:eastAsia="游ゴシック" w:hAnsi="游ゴシック" w:cstheme="minorBidi"/>
+          <w:szCs w:val="21"/>
+        </w:rPr>
+        <w:br/>
+        <w:t>なお、保証金20,000円は、ご入会日から12か月以上継続された場合、退会時に全額返金いたします。12か月未満で退会された場合は返金いたしません。</w:t>
+      </w:r>
+      <w:r>
+        <w:rPr>
+          <w:rFonts w:ascii="游ゴシック" w:eastAsia="游ゴシック" w:hAnsi="游ゴシック" w:cstheme="minorBidi"/>
+          <w:szCs w:val="21"/>
+        </w:rPr>
+        <w:br/>
+      </w:r>
+      <w:r>
+        <w:rPr>
+          <w:rFonts w:ascii="游ゴシック" w:eastAsia="游ゴシック" w:hAnsi="游ゴシック" w:cstheme="minorBidi"/>
+          <w:szCs w:val="21"/>
+        </w:rPr>
+        <w:br/>
+      </w:r>
+      <w:r>
+        <w:rPr>
+          <w:rFonts w:ascii="游ゴシック" w:eastAsia="游ゴシック" w:hAnsi="游ゴシック" w:cstheme="minorBidi"/>
+        </w:rPr>
+        <w:t>それでは、8月29日（土）のレッスンでお待ちしております。</w:t>
       </w:r>
     </w:p>
     <w:p>
       <w:pPr>
         <w:rPr>
-          <w:rFonts w:ascii="Yu Gothic" w:eastAsia="Yu Gothic" w:hAnsi="Yu Gothic" w:cstheme="minorBidi"/>
-        </w:rPr>
-      </w:pPr>
+          <w:rFonts w:ascii="游ゴシック" w:eastAsia="游ゴシック" w:hAnsi="游ゴシック" w:cs="Times New Roman"/>
+        </w:rPr>
+      </w:pPr>
+      <w:r>
+        <w:rPr>
+          <w:rFonts w:ascii="游ゴシック" w:eastAsia="游ゴシック" w:hAnsi="游ゴシック" w:cs="ＭＳ 明朝" w:hint="eastAsia"/>
+        </w:rPr>
+        <w:t>何かご不明点やご要望がございましたら、どうぞお気軽に</w:t>
+      </w:r>
+      <w:r>
+        <w:rPr>
+          <w:rFonts w:ascii="游ゴシック" w:eastAsia="游ゴシック" w:hAnsi="游ゴシック" w:cs="ＭＳ 明朝"/>
+        </w:rPr>
+        <w:t>ご連絡ください</w:t>
+      </w:r>
+      <w:r>
+        <w:rPr>
+          <w:rFonts w:ascii="游ゴシック" w:eastAsia="游ゴシック" w:hAnsi="游ゴシック" w:cs="ＭＳ 明朝" w:hint="eastAsia"/>
+        </w:rPr>
+        <w:t>。</w:t>
+      </w:r>
+      <w:r>
+        <w:rPr>
+          <w:rFonts w:ascii="游ゴシック" w:eastAsia="游ゴシック" w:hAnsi="游ゴシック" w:cs="ＭＳ 明朝"/>
+        </w:rPr>
+        <w:br/>
+      </w:r>
+      <w:r>
+        <w:rPr>
+          <w:rFonts w:ascii="游ゴシック" w:eastAsia="游ゴシック" w:hAnsi="游ゴシック" w:cs="ＭＳ 明朝" w:hint="eastAsia"/>
+        </w:rPr>
+        <w:t>今後とも何卒宜しくお願い申し上げます。</w:t>
+      </w:r>
     </w:p>
     <w:p>
-      <w:pPr>
-        <w:rPr>
-          <w:rFonts w:ascii="Yu Gothic" w:eastAsia="Yu Gothic" w:hAnsi="Yu Gothic" w:cstheme="minorBidi"/>
-        </w:rPr>
-      </w:pPr>
+      <w:r>
+        <w:rPr>
+          <w:rFonts w:ascii="游ゴシック" w:eastAsia="游ゴシック" w:hAnsi="游ゴシック" w:cstheme="minorBidi"/>
+        </w:rPr>
+        <w:br/>
+      </w:r>
     </w:p>
-    <w:p>
-      <w:pPr>
-        <w:rPr>
-          <w:rFonts w:ascii="Yu Gothic" w:eastAsia="Yu Gothic" w:hAnsi="Yu Gothic" w:cs="Times New Roman"/>
-        </w:rPr>
-      </w:pPr>
-      <w:r>
-        <w:rPr>
-          <w:rFonts w:ascii="Yu Gothic" w:eastAsia="Yu Gothic" w:hAnsi="Yu Gothic" w:cs="MS Mincho" w:hint="eastAsia"/>
-        </w:rPr>
-        <w:t>何かご不明点やご要望がございましたら、どうぞお気軽にご連絡下さい。</w:t>
-      </w:r>
-    </w:p>
-    <w:p>
-      <w:pPr>
-        <w:pStyle w:val="NormalWeb"/>
-        <w:rPr>
-          <w:rFonts w:ascii="Yu Gothic" w:eastAsia="Yu Gothic" w:hAnsi="Yu Gothic" w:cs="MS Mincho"/>
-          <w:sz w:val="22"/>
-          <w:szCs w:val="22"/>
-        </w:rPr>
-      </w:pPr>
-      <w:r>
-        <w:rPr>
-          <w:rFonts w:ascii="Yu Gothic" w:eastAsia="Yu Gothic" w:hAnsi="Yu Gothic" w:cs="MS Mincho" w:hint="eastAsia"/>
-          <w:sz w:val="22"/>
-          <w:szCs w:val="22"/>
-        </w:rPr>
-        <w:t>今後とも何卒宜しくお願い申し上げます。</w:t>
-      </w:r>
-    </w:p>
-    <w:p/>
     <w:p/>
     <w:sectPr>
       <w:pgSz w:w="12240" w:h="15840"/>
@@ -1071,7 +1064,7 @@
     <w:lsdException w:name="Unresolved Mention" w:semiHidden="1" w:unhideWhenUsed="1"/>
     <w:lsdException w:name="Smart Link" w:semiHidden="1" w:unhideWhenUsed="1"/>
   </w:latentStyles>
-  <w:style w:type="paragraph" w:default="1" w:styleId="Normal">
+  <w:style w:type="paragraph" w:default="1" w:styleId="a">
     <w:name w:val="Normal"/>
     <w:qFormat/>
     <w:rsid w:val="00E00AB4"/>
@@ -1085,12 +1078,12 @@
       <w:sz w:val="22"/>
     </w:rPr>
   </w:style>
-  <w:style w:type="character" w:default="1" w:styleId="DefaultParagraphFont">
+  <w:style w:type="character" w:default="1" w:styleId="a0">
     <w:name w:val="Default Paragraph Font"/>
     <w:uiPriority w:val="1"/>
     <w:unhideWhenUsed/>
   </w:style>
-  <w:style w:type="table" w:default="1" w:styleId="TableNormal">
+  <w:style w:type="table" w:default="1" w:styleId="a1">
     <w:name w:val="Normal Table"/>
     <w:uiPriority w:val="99"/>
     <w:semiHidden/>
@@ -1105,16 +1098,16 @@
       </w:tblCellMar>
     </w:tblPr>
   </w:style>
-  <w:style w:type="numbering" w:default="1" w:styleId="NoList">
+  <w:style w:type="numbering" w:default="1" w:styleId="a2">
     <w:name w:val="No List"/>
     <w:uiPriority w:val="99"/>
     <w:semiHidden/>
     <w:unhideWhenUsed/>
   </w:style>
-  <w:style w:type="paragraph" w:styleId="PlainText">
+  <w:style w:type="paragraph" w:styleId="a3">
     <w:name w:val="Plain Text"/>
-    <w:basedOn w:val="Normal"/>
-    <w:link w:val="PlainTextChar"/>
+    <w:basedOn w:val="a"/>
+    <w:link w:val="a4"/>
     <w:uiPriority w:val="99"/>
     <w:unhideWhenUsed/>
     <w:rsid w:val="00190880"/>
@@ -1123,10 +1116,10 @@
       <w:szCs w:val="21"/>
     </w:rPr>
   </w:style>
-  <w:style w:type="character" w:customStyle="1" w:styleId="PlainTextChar">
-    <w:name w:val="Plain Text Char"/>
-    <w:basedOn w:val="DefaultParagraphFont"/>
-    <w:link w:val="PlainText"/>
+  <w:style w:type="character" w:customStyle="1" w:styleId="a4">
+    <w:name w:val="書式なし (文字)"/>
+    <w:basedOn w:val="a0"/>
+    <w:link w:val="a3"/>
     <w:uiPriority w:val="99"/>
     <w:rsid w:val="00190880"/>
     <w:rPr>
@@ -1138,12 +1131,12 @@
   </w:style>
   <w:style w:type="character" w:customStyle="1" w:styleId="gmail-rynqvb">
     <w:name w:val="gmail-rynqvb"/>
-    <w:basedOn w:val="DefaultParagraphFont"/>
+    <w:basedOn w:val="a0"/>
     <w:rsid w:val="00CF2936"/>
   </w:style>
-  <w:style w:type="paragraph" w:styleId="NormalWeb">
+  <w:style w:type="paragraph" w:styleId="Web">
     <w:name w:val="Normal (Web)"/>
-    <w:basedOn w:val="Normal"/>
+    <w:basedOn w:val="a"/>
     <w:uiPriority w:val="99"/>
     <w:semiHidden/>
     <w:unhideWhenUsed/>
@@ -1157,9 +1150,9 @@
       <w:szCs w:val="24"/>
     </w:rPr>
   </w:style>
-  <w:style w:type="character" w:styleId="Hyperlink">
+  <w:style w:type="character" w:styleId="a5">
     <w:name w:val="Hyperlink"/>
-    <w:basedOn w:val="DefaultParagraphFont"/>
+    <w:basedOn w:val="a0"/>
     <w:uiPriority w:val="99"/>
     <w:unhideWhenUsed/>
     <w:rsid w:val="00E00AB4"/>
@@ -1168,9 +1161,9 @@
       <w:u w:val="single"/>
     </w:rPr>
   </w:style>
-  <w:style w:type="character" w:styleId="UnresolvedMention">
+  <w:style w:type="character" w:styleId="a6">
     <w:name w:val="Unresolved Mention"/>
-    <w:basedOn w:val="DefaultParagraphFont"/>
+    <w:basedOn w:val="a0"/>
     <w:uiPriority w:val="99"/>
     <w:semiHidden/>
     <w:unhideWhenUsed/>

</xml_diff>